<commit_message>
fix: restore correct local content for files clobbered by prior stale index
</commit_message>
<xml_diff>
--- a/templates/bhargav_makwana_cv.docx
+++ b/templates/bhargav_makwana_cv.docx
@@ -4,7 +4,7 @@
   <w:body>
     <w:tbl>
       <w:tblPr>
-        <w:tblW w:w="9639" w:type="dxa"/>
+        <w:tblW w:w="9663" w:type="dxa"/>
         <w:tblCellMar>
           <w:left w:w="10" w:type="dxa"/>
           <w:right w:w="10" w:type="dxa"/>
@@ -12,8 +12,8 @@
         <w:tblLook w:val="0000" w:firstRow="0" w:lastRow="0" w:firstColumn="0" w:lastColumn="0" w:noHBand="0" w:noVBand="0"/>
       </w:tblPr>
       <w:tblGrid>
-        <w:gridCol w:w="5670"/>
-        <w:gridCol w:w="3969"/>
+        <w:gridCol w:w="5954"/>
+        <w:gridCol w:w="3709"/>
       </w:tblGrid>
       <w:tr>
         <w:trPr>
@@ -21,7 +21,7 @@
         </w:trPr>
         <w:tc>
           <w:tcPr>
-            <w:tcW w:w="5670" w:type="dxa"/>
+            <w:tcW w:w="5954" w:type="dxa"/>
             <w:shd w:val="clear" w:color="auto" w:fill="1C3557"/>
             <w:tcMar>
               <w:top w:w="240" w:type="dxa"/>
@@ -79,7 +79,7 @@
         </w:tc>
         <w:tc>
           <w:tcPr>
-            <w:tcW w:w="3969" w:type="dxa"/>
+            <w:tcW w:w="3709" w:type="dxa"/>
             <w:shd w:val="clear" w:color="auto" w:fill="1C3557"/>
             <w:tcMar>
               <w:top w:w="200" w:type="dxa"/>
@@ -92,7 +92,7 @@
           <w:p>
             <w:pPr>
               <w:spacing w:after="60" w:line="360" w:lineRule="auto"/>
-              <w:ind w:left="-1222"/>
+              <w:ind w:left="-937"/>
               <w:jc w:val="right"/>
               <w:rPr>
                 <w:rFonts w:asciiTheme="minorHAnsi" w:eastAsia="Arial" w:hAnsiTheme="minorHAnsi" w:cstheme="minorHAnsi"/>
@@ -112,6 +112,7 @@
           <w:p>
             <w:pPr>
               <w:spacing w:after="60" w:line="360" w:lineRule="auto"/>
+              <w:ind w:left="-937" w:hanging="142"/>
               <w:jc w:val="right"/>
               <w:rPr>
                 <w:rFonts w:asciiTheme="minorHAnsi" w:hAnsiTheme="minorHAnsi" w:cstheme="minorHAnsi"/>
@@ -134,6 +135,7 @@
           <w:p>
             <w:pPr>
               <w:spacing w:line="360" w:lineRule="auto"/>
+              <w:ind w:left="-937"/>
               <w:jc w:val="right"/>
               <w:rPr>
                 <w:rFonts w:asciiTheme="minorHAnsi" w:eastAsia="Arial" w:hAnsiTheme="minorHAnsi" w:cstheme="minorHAnsi"/>
@@ -157,6 +159,7 @@
           <w:p>
             <w:pPr>
               <w:spacing w:line="360" w:lineRule="auto"/>
+              <w:ind w:left="-2496" w:hanging="567"/>
               <w:jc w:val="right"/>
               <w:rPr>
                 <w:rFonts w:asciiTheme="minorHAnsi" w:hAnsiTheme="minorHAnsi" w:cstheme="minorHAnsi"/>
@@ -247,7 +250,23 @@
           <w:color w:val="000000" w:themeColor="text1"/>
           <w:sz w:val="18"/>
         </w:rPr>
-        <w:t>Data Quality professional with 3+ years' experience in enterprise DQ governance and Master Data Management at ALDI DX. Specialized in SQL-based data profiling, DQ rule design and executive reporting across SAP S/4HANA environments. I thrive collaborating across technical and business teams, turning complex data issues into structured and actionable insights. I am driven by clarity and teamwork. I believe good data governance is built on trust and transparent communication with stakeholders.</w:t>
+        <w:t xml:space="preserve">Data Quality </w:t>
+      </w:r>
+      <w:r>
+        <w:rPr>
+          <w:rFonts w:asciiTheme="minorHAnsi" w:eastAsia="Arial" w:hAnsiTheme="minorHAnsi" w:cstheme="minorHAnsi"/>
+          <w:color w:val="000000" w:themeColor="text1"/>
+          <w:sz w:val="18"/>
+        </w:rPr>
+        <w:t>professional with 3+ years of</w:t>
+      </w:r>
+      <w:r>
+        <w:rPr>
+          <w:rFonts w:asciiTheme="minorHAnsi" w:eastAsia="Arial" w:hAnsiTheme="minorHAnsi" w:cstheme="minorHAnsi"/>
+          <w:color w:val="000000" w:themeColor="text1"/>
+          <w:sz w:val="18"/>
+        </w:rPr>
+        <w:t xml:space="preserve"> experience in enterprise DQ governance and Master Data Management at ALDI DX. Specialized in SQL-based data profiling, DQ rule design and executive reporting for SAP S/4HANA master data, defining and implementing rules in coordination with domain owners who specify field-level business requirements. I thrive collaborating across technical and business teams, turning complex data issues into structured and actionable insights. I am driven by clarity and teamwork; I believe good data governance is built on trust and transparent communication with stakeholders. I am known for quickly mastering new systems and technologies and delivering reliably under high workload.</w:t>
       </w:r>
     </w:p>
     <w:p>
@@ -274,7 +293,7 @@
     </w:p>
     <w:tbl>
       <w:tblPr>
-        <w:tblW w:w="9711" w:type="dxa"/>
+        <w:tblW w:w="9706" w:type="dxa"/>
         <w:tblCellMar>
           <w:left w:w="10" w:type="dxa"/>
           <w:right w:w="10" w:type="dxa"/>
@@ -282,13 +301,13 @@
         <w:tblLook w:val="0000" w:firstRow="0" w:lastRow="0" w:firstColumn="0" w:lastColumn="0" w:noHBand="0" w:noVBand="0"/>
       </w:tblPr>
       <w:tblGrid>
-        <w:gridCol w:w="1985"/>
+        <w:gridCol w:w="1980"/>
         <w:gridCol w:w="7726"/>
       </w:tblGrid>
       <w:tr>
         <w:tc>
           <w:tcPr>
-            <w:tcW w:w="1985" w:type="dxa"/>
+            <w:tcW w:w="1980" w:type="dxa"/>
             <w:tcMar>
               <w:top w:w="200" w:type="dxa"/>
               <w:left w:w="0" w:type="dxa"/>
@@ -298,7 +317,6 @@
           </w:tcPr>
           <w:p>
             <w:pPr>
-              <w:ind w:right="155"/>
               <w:rPr>
                 <w:rFonts w:asciiTheme="minorHAnsi" w:hAnsiTheme="minorHAnsi" w:cstheme="minorHAnsi"/>
                 <w:color w:val="000000" w:themeColor="text1"/>
@@ -412,8 +430,7 @@
                 <w:b/>
                 <w:bCs/>
                 <w:color w:val="1C3557"/>
-                <w:sz w:val="18"/>
-                <w:szCs w:val="18"/>
+                <w:szCs w:val="22"/>
               </w:rPr>
             </w:pPr>
             <w:r>
@@ -422,33 +439,31 @@
                 <w:b/>
                 <w:bCs/>
                 <w:color w:val="1C3557"/>
-                <w:sz w:val="18"/>
-                <w:szCs w:val="18"/>
-              </w:rPr>
-              <w:t>Data Quality Steward</w:t>
-            </w:r>
-          </w:p>
-          <w:p>
-            <w:pPr>
-              <w:rPr>
-                <w:rFonts w:asciiTheme="minorHAnsi" w:hAnsiTheme="minorHAnsi" w:cstheme="minorHAnsi"/>
-                <w:sz w:val="18"/>
-                <w:szCs w:val="18"/>
-                <w:lang w:val="de-DE"/>
-              </w:rPr>
-            </w:pPr>
-            <w:r>
+                <w:szCs w:val="22"/>
+              </w:rPr>
+              <w:t xml:space="preserve">Data Quality </w:t>
+            </w:r>
+            <w:r>
+              <w:rPr>
+                <w:rFonts w:asciiTheme="minorHAnsi" w:eastAsia="Arial" w:hAnsiTheme="minorHAnsi" w:cstheme="minorHAnsi"/>
+                <w:b/>
+                <w:bCs/>
+                <w:color w:val="1C3557"/>
+                <w:szCs w:val="22"/>
+              </w:rPr>
+              <w:t>Developer</w:t>
+            </w:r>
+          </w:p>
+          <w:p>
+            <w:pPr>
               <w:rPr>
                 <w:rFonts w:asciiTheme="minorHAnsi" w:eastAsia="Arial" w:hAnsiTheme="minorHAnsi" w:cstheme="minorHAnsi"/>
                 <w:b/>
                 <w:bCs/>
                 <w:color w:val="2E6DA4"/>
                 <w:sz w:val="18"/>
-                <w:szCs w:val="18"/>
-                <w:lang w:val="de-DE"/>
-              </w:rPr>
-              <w:t xml:space="preserve">ALDI DX  •  </w:t>
-            </w:r>
+              </w:rPr>
+            </w:pPr>
             <w:r>
               <w:rPr>
                 <w:rFonts w:asciiTheme="minorHAnsi" w:eastAsia="Arial" w:hAnsiTheme="minorHAnsi" w:cstheme="minorHAnsi"/>
@@ -456,10 +471,8 @@
                 <w:bCs/>
                 <w:color w:val="2E6DA4"/>
                 <w:sz w:val="18"/>
-                <w:szCs w:val="18"/>
-                <w:lang w:val="de-DE"/>
-              </w:rPr>
-              <w:t>Mülheim an der Ruhr</w:t>
+              </w:rPr>
+              <w:t xml:space="preserve">ALDI DX  •  </w:t>
             </w:r>
             <w:r>
               <w:rPr>
@@ -468,10 +481,8 @@
                 <w:bCs/>
                 <w:color w:val="2E6DA4"/>
                 <w:sz w:val="18"/>
-                <w:szCs w:val="18"/>
-                <w:lang w:val="de-DE"/>
-              </w:rPr>
-              <w:t>, Germany</w:t>
+              </w:rPr>
+              <w:t>Mülheim an der Ruhr</w:t>
             </w:r>
             <w:r>
               <w:rPr>
@@ -480,10 +491,8 @@
                 <w:bCs/>
                 <w:color w:val="2E6DA4"/>
                 <w:sz w:val="18"/>
-                <w:szCs w:val="18"/>
-                <w:lang w:val="de-DE"/>
-              </w:rPr>
-              <w:t xml:space="preserve"> </w:t>
+              </w:rPr>
+              <w:t>, Germany</w:t>
             </w:r>
             <w:r>
               <w:rPr>
@@ -492,10 +501,38 @@
                 <w:bCs/>
                 <w:color w:val="2E6DA4"/>
                 <w:sz w:val="18"/>
+              </w:rPr>
+              <w:t xml:space="preserve"> </w:t>
+            </w:r>
+            <w:r>
+              <w:rPr>
+                <w:rFonts w:asciiTheme="minorHAnsi" w:eastAsia="Arial" w:hAnsiTheme="minorHAnsi" w:cstheme="minorHAnsi"/>
+                <w:b/>
+                <w:bCs/>
+                <w:color w:val="2E6DA4"/>
+                <w:sz w:val="18"/>
+              </w:rPr>
+              <w:t>(Hybrid)</w:t>
+            </w:r>
+          </w:p>
+          <w:p>
+            <w:pPr>
+              <w:rPr>
+                <w:rFonts w:asciiTheme="minorHAnsi" w:hAnsiTheme="minorHAnsi" w:cstheme="minorHAnsi"/>
+                <w:sz w:val="18"/>
                 <w:szCs w:val="18"/>
-                <w:lang w:val="de-DE"/>
-              </w:rPr>
-              <w:t>(Hybrid)</w:t>
+              </w:rPr>
+            </w:pPr>
+            <w:r>
+              <w:rPr>
+                <w:rFonts w:asciiTheme="minorHAnsi" w:eastAsia="Arial" w:hAnsiTheme="minorHAnsi" w:cstheme="minorHAnsi"/>
+                <w:b/>
+                <w:bCs/>
+                <w:color w:val="000000"/>
+                <w:sz w:val="18"/>
+                <w:szCs w:val="18"/>
+              </w:rPr>
+              <w:t>Technologies:  Collibra · Syniti · Microsoft SQL Server (SSMS) · Tableau · JIRA (Test Xray)</w:t>
             </w:r>
           </w:p>
           <w:p>
@@ -519,23 +556,53 @@
                 <w:color w:val="000000" w:themeColor="text1"/>
                 <w:sz w:val="18"/>
               </w:rPr>
-              <w:t>Own end-to-end DQ rule management for the Supplier</w:t>
-            </w:r>
-            <w:r>
-              <w:rPr>
-                <w:rFonts w:asciiTheme="minorHAnsi" w:eastAsia="Arial" w:hAnsiTheme="minorHAnsi" w:cstheme="minorHAnsi"/>
-                <w:color w:val="000000" w:themeColor="text1"/>
-                <w:sz w:val="18"/>
-              </w:rPr>
-              <w:t xml:space="preserve"> and Finance</w:t>
-            </w:r>
-            <w:r>
-              <w:rPr>
-                <w:rFonts w:asciiTheme="minorHAnsi" w:eastAsia="Arial" w:hAnsiTheme="minorHAnsi" w:cstheme="minorHAnsi"/>
-                <w:color w:val="000000" w:themeColor="text1"/>
-                <w:sz w:val="18"/>
-              </w:rPr>
-              <w:t xml:space="preserve"> domain across SAP S/4HANA master data, establishing and enforcing data standards used by cross-functional stakeholders across the enterprise</w:t>
+              <w:t>Own end-to-end DQ workflow for Supplier and Finance domains in SAP S/4HANA: define rules with domain owners, build the underlying Intermediate Data Layer (IDL) and SQL reports in Syniti, and route defects to the relevant admin team for correction</w:t>
+            </w:r>
+          </w:p>
+          <w:p>
+            <w:pPr>
+              <w:pStyle w:val="ListParagraph"/>
+              <w:numPr>
+                <w:ilvl w:val="0"/>
+                <w:numId w:val="2"/>
+              </w:numPr>
+              <w:spacing w:before="120"/>
+              <w:rPr>
+                <w:rFonts w:asciiTheme="minorHAnsi" w:eastAsia="Arial" w:hAnsiTheme="minorHAnsi" w:cstheme="minorHAnsi"/>
+                <w:color w:val="000000" w:themeColor="text1"/>
+                <w:sz w:val="18"/>
+              </w:rPr>
+            </w:pPr>
+            <w:r>
+              <w:rPr>
+                <w:rFonts w:asciiTheme="minorHAnsi" w:eastAsia="Arial" w:hAnsiTheme="minorHAnsi" w:cstheme="minorHAnsi"/>
+                <w:color w:val="000000" w:themeColor="text1"/>
+                <w:sz w:val="18"/>
+              </w:rPr>
+              <w:t>Aggregate defects across data objects (Supplier, Contracts, Real Estate) into Tableau KPI dashboards used by Top Management across countries to track data health, defect-correction compliance, and week-over-week anomalies that could signal a business-impacting issue</w:t>
+            </w:r>
+          </w:p>
+          <w:p>
+            <w:pPr>
+              <w:pStyle w:val="ListParagraph"/>
+              <w:numPr>
+                <w:ilvl w:val="0"/>
+                <w:numId w:val="2"/>
+              </w:numPr>
+              <w:spacing w:before="120"/>
+              <w:rPr>
+                <w:rFonts w:asciiTheme="minorHAnsi" w:eastAsia="Arial" w:hAnsiTheme="minorHAnsi" w:cstheme="minorHAnsi"/>
+                <w:color w:val="000000" w:themeColor="text1"/>
+                <w:sz w:val="18"/>
+              </w:rPr>
+            </w:pPr>
+            <w:r>
+              <w:rPr>
+                <w:rFonts w:asciiTheme="minorHAnsi" w:eastAsia="Arial" w:hAnsiTheme="minorHAnsi" w:cstheme="minorHAnsi"/>
+                <w:color w:val="000000" w:themeColor="text1"/>
+                <w:sz w:val="18"/>
+              </w:rPr>
+              <w:t>Manage business-critical mapping logic ensuring reports correctly interpret SAP organisational structures: company codes, purchasing organisations, and sales organisations, and route defects to the responsible country group for correction</w:t>
             </w:r>
           </w:p>
           <w:p>
@@ -548,80 +615,17 @@
               <w:spacing w:before="120"/>
               <w:ind w:left="437" w:hanging="278"/>
               <w:rPr>
-                <w:rFonts w:asciiTheme="minorHAnsi" w:eastAsia="Arial" w:hAnsiTheme="minorHAnsi" w:cstheme="minorHAnsi"/>
-                <w:color w:val="000000" w:themeColor="text1"/>
-                <w:sz w:val="18"/>
-              </w:rPr>
-            </w:pPr>
-            <w:r>
-              <w:rPr>
-                <w:rFonts w:asciiTheme="minorHAnsi" w:eastAsia="Arial" w:hAnsiTheme="minorHAnsi" w:cstheme="minorHAnsi"/>
-                <w:color w:val="000000" w:themeColor="text1"/>
-                <w:sz w:val="18"/>
-              </w:rPr>
-              <w:t>Design and deliver executive-facing DQ dashboards tracking defect rates a</w:t>
-            </w:r>
-            <w:r>
-              <w:rPr>
-                <w:rFonts w:asciiTheme="minorHAnsi" w:eastAsia="Arial" w:hAnsiTheme="minorHAnsi" w:cstheme="minorHAnsi"/>
-                <w:color w:val="000000" w:themeColor="text1"/>
-                <w:sz w:val="18"/>
-              </w:rPr>
-              <w:t>nd data health KPIs, providing top</w:t>
-            </w:r>
-            <w:r>
-              <w:rPr>
-                <w:rFonts w:asciiTheme="minorHAnsi" w:eastAsia="Arial" w:hAnsiTheme="minorHAnsi" w:cstheme="minorHAnsi"/>
-                <w:color w:val="000000" w:themeColor="text1"/>
-                <w:sz w:val="18"/>
-              </w:rPr>
-              <w:t>-level management with real-time visibility into master data quality</w:t>
-            </w:r>
-          </w:p>
-          <w:p>
-            <w:pPr>
-              <w:pStyle w:val="ListParagraph"/>
-              <w:numPr>
-                <w:ilvl w:val="0"/>
-                <w:numId w:val="2"/>
-              </w:numPr>
-              <w:spacing w:before="120"/>
-              <w:rPr>
-                <w:rFonts w:asciiTheme="minorHAnsi" w:eastAsia="Arial" w:hAnsiTheme="minorHAnsi" w:cstheme="minorHAnsi"/>
-                <w:color w:val="000000" w:themeColor="text1"/>
-                <w:sz w:val="18"/>
-              </w:rPr>
-            </w:pPr>
-            <w:r>
-              <w:rPr>
-                <w:rFonts w:asciiTheme="minorHAnsi" w:eastAsia="Arial" w:hAnsiTheme="minorHAnsi" w:cstheme="minorHAnsi"/>
-                <w:color w:val="000000" w:themeColor="text1"/>
-                <w:sz w:val="18"/>
-              </w:rPr>
-              <w:t>Conduct SQL-based data profiling and root cause analysis to detect integrity anomalies, producing structured remediation recommendations actioned by development and business teams.</w:t>
-            </w:r>
-          </w:p>
-          <w:p>
-            <w:pPr>
-              <w:pStyle w:val="ListParagraph"/>
-              <w:numPr>
-                <w:ilvl w:val="0"/>
-                <w:numId w:val="2"/>
-              </w:numPr>
-              <w:spacing w:before="120"/>
-              <w:rPr>
-                <w:rFonts w:asciiTheme="minorHAnsi" w:eastAsia="Arial" w:hAnsiTheme="minorHAnsi" w:cstheme="minorHAnsi"/>
-                <w:color w:val="000000" w:themeColor="text1"/>
-                <w:sz w:val="18"/>
-              </w:rPr>
-            </w:pPr>
-            <w:r>
-              <w:rPr>
-                <w:rFonts w:asciiTheme="minorHAnsi" w:eastAsia="Arial" w:hAnsiTheme="minorHAnsi" w:cstheme="minorHAnsi"/>
-                <w:color w:val="000000" w:themeColor="text1"/>
-                <w:sz w:val="18"/>
-              </w:rPr>
-              <w:t>Lead requirements alignment sessions with domain data owners and business users to optimise DQ report acceptance and drive shared accountability for data health</w:t>
+                <w:rFonts w:asciiTheme="minorHAnsi" w:hAnsiTheme="minorHAnsi" w:cstheme="minorHAnsi"/>
+                <w:sz w:val="18"/>
+              </w:rPr>
+            </w:pPr>
+            <w:r>
+              <w:rPr>
+                <w:rFonts w:asciiTheme="minorHAnsi" w:eastAsia="Arial" w:hAnsiTheme="minorHAnsi" w:cstheme="minorHAnsi"/>
+                <w:color w:val="000000" w:themeColor="text1"/>
+                <w:sz w:val="18"/>
+              </w:rPr>
+              <w:t>Perform root cause analysis on data anomalies and resolve production incidents by connecting SAP source data, report logic, and business processes, validating fixes and coordinating remediation with development and business teams</w:t>
             </w:r>
           </w:p>
           <w:p>
@@ -644,7 +648,53 @@
                 <w:color w:val="000000" w:themeColor="text1"/>
                 <w:sz w:val="18"/>
               </w:rPr>
-              <w:t>Build and maintain enterprise data quality documentation and governance frameworks, ensuring consistent data management practices and regulatory compliance across departments</w:t>
+              <w:t>Coordinate cross-country testing and rollout across multiple country groups, resolving logic discrepancies and securing business acceptance; act as business-technical bridge between data governance, domain owners, country organisations, and implementation teams</w:t>
+            </w:r>
+          </w:p>
+          <w:p>
+            <w:pPr>
+              <w:pStyle w:val="ListParagraph"/>
+              <w:numPr>
+                <w:ilvl w:val="0"/>
+                <w:numId w:val="2"/>
+              </w:numPr>
+              <w:spacing w:before="120"/>
+              <w:ind w:left="437" w:hanging="278"/>
+              <w:rPr>
+                <w:rFonts w:asciiTheme="minorHAnsi" w:hAnsiTheme="minorHAnsi" w:cstheme="minorHAnsi"/>
+                <w:sz w:val="18"/>
+              </w:rPr>
+            </w:pPr>
+            <w:r>
+              <w:rPr>
+                <w:rFonts w:asciiTheme="minorHAnsi" w:eastAsia="Arial" w:hAnsiTheme="minorHAnsi" w:cstheme="minorHAnsi"/>
+                <w:color w:val="000000" w:themeColor="text1"/>
+                <w:sz w:val="18"/>
+              </w:rPr>
+              <w:t>Maintain audit-ready documentation in Collibra (rule definitions, pseudo-code, approval workflows, validation evidence) and contribute to international data governance forums driving cross-functional decisions</w:t>
+            </w:r>
+          </w:p>
+          <w:p>
+            <w:pPr>
+              <w:pStyle w:val="ListParagraph"/>
+              <w:numPr>
+                <w:ilvl w:val="0"/>
+                <w:numId w:val="2"/>
+              </w:numPr>
+              <w:spacing w:before="120"/>
+              <w:ind w:left="437" w:hanging="278"/>
+              <w:rPr>
+                <w:rFonts w:asciiTheme="minorHAnsi" w:hAnsiTheme="minorHAnsi" w:cstheme="minorHAnsi"/>
+                <w:sz w:val="18"/>
+              </w:rPr>
+            </w:pPr>
+            <w:r>
+              <w:rPr>
+                <w:rFonts w:asciiTheme="minorHAnsi" w:eastAsia="Arial" w:hAnsiTheme="minorHAnsi" w:cstheme="minorHAnsi"/>
+                <w:color w:val="000000" w:themeColor="text1"/>
+                <w:sz w:val="18"/>
+              </w:rPr>
+              <w:t>Designed and built an internal GPT-based tool to auto-generate business and data quality rules from a template, iteratively optimised based on user feedback</w:t>
             </w:r>
           </w:p>
         </w:tc>
@@ -652,7 +702,7 @@
       <w:tr>
         <w:tc>
           <w:tcPr>
-            <w:tcW w:w="1985" w:type="dxa"/>
+            <w:tcW w:w="1980" w:type="dxa"/>
             <w:tcMar>
               <w:top w:w="200" w:type="dxa"/>
               <w:left w:w="0" w:type="dxa"/>
@@ -709,7 +759,7 @@
               <w:spacing w:after="20"/>
               <w:rPr>
                 <w:rFonts w:asciiTheme="minorHAnsi" w:hAnsiTheme="minorHAnsi" w:cstheme="minorHAnsi"/>
-                <w:sz w:val="16"/>
+                <w:sz w:val="18"/>
               </w:rPr>
             </w:pPr>
             <w:r>
@@ -718,7 +768,6 @@
                 <w:b/>
                 <w:bCs/>
                 <w:color w:val="1C3557"/>
-                <w:sz w:val="18"/>
                 <w:szCs w:val="22"/>
               </w:rPr>
               <w:t>Data Quality Analyst  (Working Student)</w:t>
@@ -727,13 +776,6 @@
           <w:p>
             <w:pPr>
               <w:spacing w:after="20"/>
-              <w:rPr>
-                <w:rFonts w:asciiTheme="minorHAnsi" w:hAnsiTheme="minorHAnsi" w:cstheme="minorHAnsi"/>
-                <w:sz w:val="18"/>
-                <w:lang w:val="de-DE"/>
-              </w:rPr>
-            </w:pPr>
-            <w:r>
               <w:rPr>
                 <w:rFonts w:asciiTheme="minorHAnsi" w:eastAsia="Arial" w:hAnsiTheme="minorHAnsi" w:cstheme="minorHAnsi"/>
                 <w:b/>
@@ -742,8 +784,7 @@
                 <w:sz w:val="18"/>
                 <w:lang w:val="de-DE"/>
               </w:rPr>
-              <w:t xml:space="preserve">ALDI SÜD  •  </w:t>
-            </w:r>
+            </w:pPr>
             <w:r>
               <w:rPr>
                 <w:rFonts w:asciiTheme="minorHAnsi" w:eastAsia="Arial" w:hAnsiTheme="minorHAnsi" w:cstheme="minorHAnsi"/>
@@ -753,7 +794,7 @@
                 <w:sz w:val="18"/>
                 <w:lang w:val="de-DE"/>
               </w:rPr>
-              <w:t>Mülheim an der Ruhr, Germany</w:t>
+              <w:t xml:space="preserve">ALDI SÜD  •  </w:t>
             </w:r>
             <w:r>
               <w:rPr>
@@ -764,7 +805,64 @@
                 <w:sz w:val="18"/>
                 <w:lang w:val="de-DE"/>
               </w:rPr>
+              <w:t>Mülheim an der Ruhr, Germany</w:t>
+            </w:r>
+            <w:r>
+              <w:rPr>
+                <w:rFonts w:asciiTheme="minorHAnsi" w:eastAsia="Arial" w:hAnsiTheme="minorHAnsi" w:cstheme="minorHAnsi"/>
+                <w:b/>
+                <w:bCs/>
+                <w:color w:val="2E6DA4"/>
+                <w:sz w:val="18"/>
+                <w:lang w:val="de-DE"/>
+              </w:rPr>
               <w:t xml:space="preserve"> (Hybrid)</w:t>
+            </w:r>
+          </w:p>
+          <w:p>
+            <w:pPr>
+              <w:spacing w:after="20"/>
+              <w:rPr>
+                <w:rFonts w:asciiTheme="minorHAnsi" w:hAnsiTheme="minorHAnsi" w:cstheme="minorHAnsi"/>
+                <w:sz w:val="18"/>
+              </w:rPr>
+            </w:pPr>
+            <w:r>
+              <w:rPr>
+                <w:rFonts w:asciiTheme="minorHAnsi" w:eastAsia="Arial" w:hAnsiTheme="minorHAnsi" w:cstheme="minorHAnsi"/>
+                <w:b/>
+                <w:bCs/>
+                <w:color w:val="000000"/>
+                <w:sz w:val="18"/>
+              </w:rPr>
+              <w:t xml:space="preserve">Technologies:  </w:t>
+            </w:r>
+            <w:r>
+              <w:rPr>
+                <w:rFonts w:asciiTheme="minorHAnsi" w:eastAsia="Arial" w:hAnsiTheme="minorHAnsi" w:cstheme="minorHAnsi"/>
+                <w:bCs/>
+                <w:color w:val="000000"/>
+                <w:sz w:val="18"/>
+              </w:rPr>
+              <w:t>Microsoft Azure •</w:t>
+            </w:r>
+            <w:r>
+              <w:rPr>
+                <w:rFonts w:asciiTheme="minorHAnsi" w:eastAsia="Arial" w:hAnsiTheme="minorHAnsi" w:cstheme="minorHAnsi"/>
+                <w:bCs/>
+                <w:color w:val="000000"/>
+                <w:sz w:val="18"/>
+              </w:rPr>
+              <w:t xml:space="preserve"> Databricks • Tableau •</w:t>
+            </w:r>
+            <w:r>
+              <w:rPr>
+                <w:rFonts w:asciiTheme="minorHAnsi" w:eastAsia="Arial" w:hAnsiTheme="minorHAnsi" w:cstheme="minorHAnsi"/>
+                <w:bCs/>
+                <w:color w:val="000000"/>
+                <w:sz w:val="18"/>
+              </w:rPr>
+              <w:t xml:space="preserve"> Tealium • Adobe Data Workbench</w:t>
             </w:r>
           </w:p>
           <w:p>
@@ -788,23 +886,7 @@
                 <w:color w:val="000000" w:themeColor="text1"/>
                 <w:sz w:val="18"/>
               </w:rPr>
-              <w:t>Executed structured DQ testing for Customer and Order data in the Marketing domain, evaluating data across five quality dimensions: accuracy, comp</w:t>
-            </w:r>
-            <w:r>
-              <w:rPr>
-                <w:rFonts w:asciiTheme="minorHAnsi" w:eastAsia="Arial" w:hAnsiTheme="minorHAnsi" w:cstheme="minorHAnsi"/>
-                <w:color w:val="000000" w:themeColor="text1"/>
-                <w:sz w:val="18"/>
-              </w:rPr>
-              <w:t>leteness, consistency, validity</w:t>
-            </w:r>
-            <w:r>
-              <w:rPr>
-                <w:rFonts w:asciiTheme="minorHAnsi" w:eastAsia="Arial" w:hAnsiTheme="minorHAnsi" w:cstheme="minorHAnsi"/>
-                <w:color w:val="000000" w:themeColor="text1"/>
-                <w:sz w:val="18"/>
-              </w:rPr>
-              <w:t xml:space="preserve"> and timeliness</w:t>
+              <w:t>Executed structured DQ testing for Customer and Order data in the Marketing domain, evaluating data across five quality dimensions: accuracy, completeness, consistency, validity and timeliness</w:t>
             </w:r>
           </w:p>
           <w:p>
@@ -828,7 +910,7 @@
                 <w:color w:val="000000" w:themeColor="text1"/>
                 <w:sz w:val="18"/>
               </w:rPr>
-              <w:t>Developed automated data validation pipelines in Databricks spanning multiple source systems, enabling proactive identification and escalation of data incidents before downstream impact</w:t>
+              <w:t>Developed automated data validation pipelines in Databricks spanning Spryker and Tealium source systems for customer behaviour analysis and segmentation, enabling proactive identification and escalation of data incidents before downstream impact</w:t>
             </w:r>
           </w:p>
           <w:p>
@@ -883,6 +965,28 @@
     </w:tbl>
     <w:p>
       <w:pPr>
+        <w:rPr>
+          <w:rFonts w:asciiTheme="minorHAnsi" w:eastAsia="Arial" w:hAnsiTheme="minorHAnsi" w:cstheme="minorHAnsi"/>
+          <w:b/>
+          <w:bCs/>
+          <w:color w:val="1C3557"/>
+          <w:szCs w:val="22"/>
+        </w:rPr>
+      </w:pPr>
+    </w:p>
+    <w:p>
+      <w:pPr>
+        <w:rPr>
+          <w:rFonts w:asciiTheme="minorHAnsi" w:eastAsia="Arial" w:hAnsiTheme="minorHAnsi" w:cstheme="minorHAnsi"/>
+          <w:b/>
+          <w:bCs/>
+          <w:color w:val="1C3557"/>
+          <w:szCs w:val="22"/>
+        </w:rPr>
+      </w:pPr>
+    </w:p>
+    <w:p>
+      <w:pPr>
         <w:pBdr>
           <w:bottom w:val="single" w:sz="8" w:space="4" w:color="2E6DA4"/>
         </w:pBdr>
@@ -892,6 +996,8 @@
           <w:sz w:val="18"/>
         </w:rPr>
       </w:pPr>
+      <w:bookmarkStart w:id="0" w:name="_GoBack"/>
+      <w:bookmarkEnd w:id="0"/>
       <w:r>
         <w:rPr>
           <w:rFonts w:asciiTheme="minorHAnsi" w:eastAsia="Arial" w:hAnsiTheme="minorHAnsi" w:cstheme="minorHAnsi"/>
@@ -900,6 +1006,7 @@
           <w:color w:val="1C3557"/>
           <w:szCs w:val="22"/>
         </w:rPr>
+        <w:lastRenderedPageBreak/>
         <w:t>EDUCATION</w:t>
       </w:r>
     </w:p>
@@ -1068,9 +1175,6 @@
         </w:tc>
       </w:tr>
       <w:tr>
-        <w:trPr>
-          <w:cantSplit w:val="1"/>
-        </w:trPr>
         <w:tc>
           <w:tcPr>
             <w:tcW w:w="1800" w:type="dxa"/>
@@ -1083,7 +1187,6 @@
           </w:tcPr>
           <w:p>
             <w:pPr>
-              <w:keepNext/>
               <w:rPr>
                 <w:rFonts w:asciiTheme="minorHAnsi" w:hAnsiTheme="minorHAnsi" w:cstheme="minorHAnsi"/>
                 <w:color w:val="595959" w:themeColor="text1" w:themeTint="A6"/>
@@ -1107,7 +1210,16 @@
                 <w:sz w:val="18"/>
                 <w:szCs w:val="18"/>
               </w:rPr>
-              <w:t xml:space="preserve">2018 – </w:t>
+              <w:t>2017</w:t>
+            </w:r>
+            <w:r>
+              <w:rPr>
+                <w:rFonts w:asciiTheme="minorHAnsi" w:eastAsia="Arial" w:hAnsiTheme="minorHAnsi" w:cstheme="minorHAnsi"/>
+                <w:color w:val="000000" w:themeColor="text1"/>
+                <w:sz w:val="18"/>
+                <w:szCs w:val="18"/>
+              </w:rPr>
+              <w:t xml:space="preserve"> – </w:t>
             </w:r>
             <w:r>
               <w:rPr>
@@ -1132,7 +1244,6 @@
           </w:tcPr>
           <w:p>
             <w:pPr>
-              <w:keepNext/>
               <w:spacing w:after="20"/>
               <w:rPr>
                 <w:rFonts w:asciiTheme="minorHAnsi" w:hAnsiTheme="minorHAnsi" w:cstheme="minorHAnsi"/>
@@ -1154,7 +1265,6 @@
           </w:p>
           <w:p>
             <w:pPr>
-              <w:keepNext/>
               <w:spacing w:after="60"/>
               <w:rPr>
                 <w:rFonts w:asciiTheme="minorHAnsi" w:hAnsiTheme="minorHAnsi" w:cstheme="minorHAnsi"/>
@@ -1169,23 +1279,11 @@
                 <w:sz w:val="18"/>
                 <w:szCs w:val="18"/>
               </w:rPr>
-              <w:t>Charotar University of Science and Technolo</w:t>
-            </w:r>
-            <w:bookmarkStart w:id="0" w:name="_GoBack"/>
-            <w:bookmarkEnd w:id="0"/>
-            <w:r>
-              <w:rPr>
-                <w:rFonts w:asciiTheme="minorHAnsi" w:eastAsia="Arial" w:hAnsiTheme="minorHAnsi" w:cstheme="minorHAnsi"/>
-                <w:color w:val="2E6DA4"/>
-                <w:sz w:val="18"/>
-                <w:szCs w:val="18"/>
-              </w:rPr>
-              <w:t>gy (CHARUSAT)  •  India</w:t>
-            </w:r>
-          </w:p>
-          <w:p>
-            <w:pPr>
-              <w:keepNext/>
+              <w:t>Charotar University of Science and Technology (CHARUSAT)  •  India</w:t>
+            </w:r>
+          </w:p>
+          <w:p>
+            <w:pPr>
               <w:spacing w:after="80"/>
               <w:rPr>
                 <w:rFonts w:asciiTheme="minorHAnsi" w:eastAsia="Arial" w:hAnsiTheme="minorHAnsi" w:cstheme="minorHAnsi"/>
@@ -1221,9 +1319,12 @@
           </w:p>
           <w:p>
             <w:pPr>
-              <w:spacing w:after="0"/>
-              <w:rPr>
-                <w:rFonts w:asciiTheme="minorHAnsi" w:hAnsiTheme="minorHAnsi" w:cstheme="minorHAnsi"/>
+              <w:spacing w:after="80"/>
+              <w:rPr>
+                <w:rFonts w:asciiTheme="minorHAnsi" w:eastAsia="Arial" w:hAnsiTheme="minorHAnsi" w:cstheme="minorHAnsi"/>
+                <w:i/>
+                <w:iCs/>
+                <w:color w:val="000000" w:themeColor="text1"/>
                 <w:sz w:val="18"/>
                 <w:szCs w:val="18"/>
               </w:rPr>
@@ -1234,6 +1335,7 @@
     </w:tbl>
     <w:p>
       <w:pPr>
+        <w:keepNext/>
         <w:pBdr>
           <w:bottom w:val="single" w:sz="8" w:space="4" w:color="2E6DA4"/>
         </w:pBdr>
@@ -1251,7 +1353,6 @@
           <w:color w:val="1C3557"/>
           <w:szCs w:val="22"/>
         </w:rPr>
-        <w:lastRenderedPageBreak/>
         <w:t>C</w:t>
       </w:r>
       <w:r>
@@ -1267,7 +1368,8 @@
     </w:p>
     <w:p>
       <w:pPr>
-        <w:spacing w:before="120" w:after="60" w:line="276" w:lineRule="auto"/>
+        <w:keepNext/>
+        <w:spacing w:after="60" w:line="360" w:lineRule="auto"/>
         <w:rPr>
           <w:rFonts w:asciiTheme="minorHAnsi" w:hAnsiTheme="minorHAnsi" w:cstheme="minorHAnsi"/>
           <w:sz w:val="18"/>
@@ -1281,48 +1383,28 @@
           <w:color w:val="1C3557"/>
           <w:sz w:val="18"/>
         </w:rPr>
-        <w:t>Languages &amp; Querying</w:t>
-      </w:r>
-      <w:r>
-        <w:rPr>
-          <w:rFonts w:asciiTheme="minorHAnsi" w:eastAsia="Arial" w:hAnsiTheme="minorHAnsi" w:cstheme="minorHAnsi"/>
-          <w:b/>
+        <w:t xml:space="preserve">Programming &amp; Querying:  </w:t>
+      </w:r>
+      <w:r>
+        <w:rPr>
+          <w:rFonts w:asciiTheme="minorHAnsi" w:eastAsia="Arial" w:hAnsiTheme="minorHAnsi" w:cstheme="minorHAnsi"/>
           <w:bCs/>
           <w:color w:val="000000" w:themeColor="text1"/>
           <w:sz w:val="18"/>
         </w:rPr>
-        <w:t xml:space="preserve">:  </w:t>
-      </w:r>
-      <w:r>
-        <w:rPr>
-          <w:rFonts w:asciiTheme="minorHAnsi" w:eastAsia="Arial" w:hAnsiTheme="minorHAnsi" w:cstheme="minorHAnsi"/>
-          <w:color w:val="000000" w:themeColor="text1"/>
-          <w:sz w:val="18"/>
-        </w:rPr>
-        <w:t>SQL (A</w:t>
-      </w:r>
-      <w:r>
-        <w:rPr>
-          <w:rFonts w:asciiTheme="minorHAnsi" w:eastAsia="Arial" w:hAnsiTheme="minorHAnsi" w:cstheme="minorHAnsi"/>
-          <w:color w:val="000000" w:themeColor="text1"/>
-          <w:sz w:val="18"/>
-        </w:rPr>
-        <w:t>dvanced)</w:t>
-      </w:r>
-      <w:r>
-        <w:rPr>
-          <w:rFonts w:asciiTheme="minorHAnsi" w:eastAsia="Arial" w:hAnsiTheme="minorHAnsi" w:cstheme="minorHAnsi"/>
-          <w:color w:val="000000" w:themeColor="text1"/>
-          <w:sz w:val="18"/>
-        </w:rPr>
-        <w:t>, Python</w:t>
+        <w:t>SQL (Advanced), SQL Scripting, Python</w:t>
       </w:r>
     </w:p>
     <w:p>
       <w:pPr>
-        <w:spacing w:before="120" w:after="60" w:line="276" w:lineRule="auto"/>
-        <w:rPr>
-          <w:rFonts w:asciiTheme="minorHAnsi" w:hAnsiTheme="minorHAnsi" w:cstheme="minorHAnsi"/>
+        <w:pBdr>
+          <w:bottom w:val="single" w:sz="8" w:space="4" w:color="2E6DA4"/>
+        </w:pBdr>
+        <w:spacing w:after="80" w:line="360" w:lineRule="auto"/>
+        <w:rPr>
+          <w:rFonts w:asciiTheme="minorHAnsi" w:eastAsia="Arial" w:hAnsiTheme="minorHAnsi" w:cstheme="minorHAnsi"/>
+          <w:bCs/>
+          <w:color w:val="000000" w:themeColor="text1"/>
           <w:sz w:val="18"/>
         </w:rPr>
       </w:pPr>
@@ -1334,22 +1416,27 @@
           <w:color w:val="1C3557"/>
           <w:sz w:val="18"/>
         </w:rPr>
-        <w:t xml:space="preserve">Databases:  </w:t>
-      </w:r>
-      <w:r>
-        <w:rPr>
-          <w:rFonts w:asciiTheme="minorHAnsi" w:eastAsia="Arial" w:hAnsiTheme="minorHAnsi" w:cstheme="minorHAnsi"/>
-          <w:color w:val="000000" w:themeColor="text1"/>
-          <w:sz w:val="18"/>
-        </w:rPr>
-        <w:t>Microsoft SQL Server</w:t>
+        <w:t xml:space="preserve">Business Intelligence &amp; Reporting: </w:t>
+      </w:r>
+      <w:r>
+        <w:rPr>
+          <w:rFonts w:asciiTheme="minorHAnsi" w:eastAsia="Arial" w:hAnsiTheme="minorHAnsi" w:cstheme="minorHAnsi"/>
+          <w:bCs/>
+          <w:color w:val="000000" w:themeColor="text1"/>
+          <w:sz w:val="18"/>
+        </w:rPr>
+        <w:t>Microsoft Excel, Databricks, Tableau, Microsoft Power BI, Dashboard Development, Data Visualization, KPI Reporting</w:t>
       </w:r>
     </w:p>
     <w:p>
       <w:pPr>
-        <w:spacing w:before="120" w:after="60" w:line="276" w:lineRule="auto"/>
-        <w:rPr>
-          <w:rFonts w:asciiTheme="minorHAnsi" w:hAnsiTheme="minorHAnsi" w:cstheme="minorHAnsi"/>
+        <w:pBdr>
+          <w:bottom w:val="single" w:sz="8" w:space="4" w:color="2E6DA4"/>
+        </w:pBdr>
+        <w:spacing w:after="80" w:line="360" w:lineRule="auto"/>
+        <w:rPr>
+          <w:rFonts w:asciiTheme="minorHAnsi" w:eastAsia="Arial" w:hAnsiTheme="minorHAnsi" w:cstheme="minorHAnsi"/>
+          <w:bCs/>
           <w:color w:val="000000" w:themeColor="text1"/>
           <w:sz w:val="18"/>
         </w:rPr>
@@ -1362,27 +1449,24 @@
           <w:color w:val="1C3557"/>
           <w:sz w:val="18"/>
         </w:rPr>
-        <w:t xml:space="preserve">Analytics &amp; BI:  </w:t>
-      </w:r>
-      <w:r>
-        <w:rPr>
-          <w:rFonts w:asciiTheme="minorHAnsi" w:eastAsia="Arial" w:hAnsiTheme="minorHAnsi" w:cstheme="minorHAnsi"/>
-          <w:color w:val="000000" w:themeColor="text1"/>
-          <w:sz w:val="18"/>
-        </w:rPr>
-        <w:t>Databricks, Tableau</w:t>
+        <w:t xml:space="preserve">Data Governance &amp; Data Quality: </w:t>
+      </w:r>
+      <w:r>
+        <w:rPr>
+          <w:rFonts w:asciiTheme="minorHAnsi" w:eastAsia="Arial" w:hAnsiTheme="minorHAnsi" w:cstheme="minorHAnsi"/>
+          <w:bCs/>
+          <w:color w:val="000000" w:themeColor="text1"/>
+          <w:sz w:val="18"/>
+        </w:rPr>
+        <w:t>Collibra, Master Data Management (MDM), Data Modeling, Data Quality Management, Data Lineage, Data Profiling, Data Validation, Business Rules, Root Cause Analysis, Reporting Standards, Requirements Engineering, User Acceptance Testing (UAT)</w:t>
       </w:r>
     </w:p>
     <w:p>
       <w:pPr>
-        <w:spacing w:before="120" w:after="60" w:line="276" w:lineRule="auto"/>
-        <w:rPr>
-          <w:rFonts w:asciiTheme="minorHAnsi" w:hAnsiTheme="minorHAnsi" w:cstheme="minorHAnsi"/>
-          <w:color w:val="595959" w:themeColor="text1" w:themeTint="A6"/>
-          <w:sz w:val="18"/>
-        </w:rPr>
-      </w:pPr>
-      <w:r>
+        <w:pBdr>
+          <w:bottom w:val="single" w:sz="8" w:space="4" w:color="2E6DA4"/>
+        </w:pBdr>
+        <w:spacing w:after="80" w:line="360" w:lineRule="auto"/>
         <w:rPr>
           <w:rFonts w:asciiTheme="minorHAnsi" w:eastAsia="Arial" w:hAnsiTheme="minorHAnsi" w:cstheme="minorHAnsi"/>
           <w:b/>
@@ -1390,25 +1474,6 @@
           <w:color w:val="1C3557"/>
           <w:sz w:val="18"/>
         </w:rPr>
-        <w:t xml:space="preserve">Data Quality &amp; Governance:  </w:t>
-      </w:r>
-      <w:r>
-        <w:rPr>
-          <w:rFonts w:asciiTheme="minorHAnsi" w:eastAsia="Arial" w:hAnsiTheme="minorHAnsi" w:cstheme="minorHAnsi"/>
-          <w:color w:val="000000" w:themeColor="text1"/>
-          <w:sz w:val="18"/>
-        </w:rPr>
-        <w:t>Collibra, Master Data Management (MDM), Data Profiling, Root Cause Analysis, Data Lineage</w:t>
-      </w:r>
-    </w:p>
-    <w:p>
-      <w:pPr>
-        <w:spacing w:before="120" w:after="60" w:line="276" w:lineRule="auto"/>
-        <w:rPr>
-          <w:rFonts w:asciiTheme="minorHAnsi" w:hAnsiTheme="minorHAnsi" w:cstheme="minorHAnsi"/>
-          <w:color w:val="595959" w:themeColor="text1" w:themeTint="A6"/>
-          <w:sz w:val="18"/>
-        </w:rPr>
       </w:pPr>
       <w:r>
         <w:rPr>
@@ -1418,23 +1483,28 @@
           <w:color w:val="1C3557"/>
           <w:sz w:val="18"/>
         </w:rPr>
-        <w:t xml:space="preserve">Enterprise Systems:  </w:t>
-      </w:r>
-      <w:r>
-        <w:rPr>
-          <w:rFonts w:asciiTheme="minorHAnsi" w:eastAsia="Arial" w:hAnsiTheme="minorHAnsi" w:cstheme="minorHAnsi"/>
-          <w:color w:val="000000" w:themeColor="text1"/>
-          <w:sz w:val="18"/>
-        </w:rPr>
-        <w:t>SAP S/4HANA, SAP Master Data Governance (MDG)</w:t>
+        <w:t xml:space="preserve">Data Engineering &amp; Platforms: </w:t>
+      </w:r>
+      <w:r>
+        <w:rPr>
+          <w:rFonts w:asciiTheme="minorHAnsi" w:eastAsia="Arial" w:hAnsiTheme="minorHAnsi" w:cstheme="minorHAnsi"/>
+          <w:bCs/>
+          <w:color w:val="000000" w:themeColor="text1"/>
+          <w:sz w:val="18"/>
+        </w:rPr>
+        <w:t>Microsoft SQL Server (SSMS), Microsoft Azure, SAP S/4HANA, SAP Master Data Governance (MDG), Syniti</w:t>
       </w:r>
     </w:p>
     <w:p>
       <w:pPr>
-        <w:spacing w:before="120" w:after="60" w:line="276" w:lineRule="auto"/>
-        <w:rPr>
-          <w:rFonts w:asciiTheme="minorHAnsi" w:hAnsiTheme="minorHAnsi" w:cstheme="minorHAnsi"/>
-          <w:color w:val="595959" w:themeColor="text1" w:themeTint="A6"/>
+        <w:pBdr>
+          <w:bottom w:val="single" w:sz="8" w:space="4" w:color="2E6DA4"/>
+        </w:pBdr>
+        <w:spacing w:after="80" w:line="360" w:lineRule="auto"/>
+        <w:rPr>
+          <w:rFonts w:asciiTheme="minorHAnsi" w:eastAsia="Arial" w:hAnsiTheme="minorHAnsi" w:cstheme="minorHAnsi"/>
+          <w:bCs/>
+          <w:color w:val="000000" w:themeColor="text1"/>
           <w:sz w:val="18"/>
         </w:rPr>
       </w:pPr>
@@ -1446,27 +1516,24 @@
           <w:color w:val="1C3557"/>
           <w:sz w:val="18"/>
         </w:rPr>
-        <w:t xml:space="preserve">Testing &amp; Documentation:  </w:t>
-      </w:r>
-      <w:r>
-        <w:rPr>
-          <w:rFonts w:asciiTheme="minorHAnsi" w:eastAsia="Arial" w:hAnsiTheme="minorHAnsi" w:cstheme="minorHAnsi"/>
-          <w:color w:val="000000" w:themeColor="text1"/>
-          <w:sz w:val="18"/>
-        </w:rPr>
-        <w:t>JIRA (Test Xray), Confluence, Test Case Design</w:t>
+        <w:t xml:space="preserve">Project Delivery &amp; Testing: </w:t>
+      </w:r>
+      <w:r>
+        <w:rPr>
+          <w:rFonts w:asciiTheme="minorHAnsi" w:eastAsia="Arial" w:hAnsiTheme="minorHAnsi" w:cstheme="minorHAnsi"/>
+          <w:bCs/>
+          <w:color w:val="000000" w:themeColor="text1"/>
+          <w:sz w:val="18"/>
+        </w:rPr>
+        <w:t>Agile, Kanban, JIRA, Confluence, Xray, Test Case Design, Process Digitalization, Incident &amp; Ticket Management</w:t>
       </w:r>
     </w:p>
     <w:p>
       <w:pPr>
-        <w:spacing w:before="120" w:after="60" w:line="276" w:lineRule="auto"/>
-        <w:rPr>
-          <w:rFonts w:asciiTheme="minorHAnsi" w:eastAsia="Arial" w:hAnsiTheme="minorHAnsi" w:cstheme="minorHAnsi"/>
-          <w:color w:val="000000" w:themeColor="text1"/>
-          <w:sz w:val="18"/>
-        </w:rPr>
-      </w:pPr>
-      <w:r>
+        <w:pBdr>
+          <w:bottom w:val="single" w:sz="8" w:space="4" w:color="2E6DA4"/>
+        </w:pBdr>
+        <w:spacing w:after="80" w:line="360" w:lineRule="auto"/>
         <w:rPr>
           <w:rFonts w:asciiTheme="minorHAnsi" w:eastAsia="Arial" w:hAnsiTheme="minorHAnsi" w:cstheme="minorHAnsi"/>
           <w:b/>
@@ -1474,15 +1541,25 @@
           <w:color w:val="1C3557"/>
           <w:sz w:val="18"/>
         </w:rPr>
-        <w:t xml:space="preserve">Project Management:  </w:t>
-      </w:r>
-      <w:r>
-        <w:rPr>
-          <w:rFonts w:asciiTheme="minorHAnsi" w:eastAsia="Arial" w:hAnsiTheme="minorHAnsi" w:cstheme="minorHAnsi"/>
-          <w:color w:val="000000" w:themeColor="text1"/>
-          <w:sz w:val="18"/>
-        </w:rPr>
-        <w:t>Kanban, Agile, JIRA</w:t>
+      </w:pPr>
+      <w:r>
+        <w:rPr>
+          <w:rFonts w:asciiTheme="minorHAnsi" w:eastAsia="Arial" w:hAnsiTheme="minorHAnsi" w:cstheme="minorHAnsi"/>
+          <w:b/>
+          <w:bCs/>
+          <w:color w:val="1C3557"/>
+          <w:sz w:val="18"/>
+        </w:rPr>
+        <w:t xml:space="preserve">Business Analysis &amp; Collaboration: </w:t>
+      </w:r>
+      <w:r>
+        <w:rPr>
+          <w:rFonts w:asciiTheme="minorHAnsi" w:eastAsia="Arial" w:hAnsiTheme="minorHAnsi" w:cstheme="minorHAnsi"/>
+          <w:bCs/>
+          <w:color w:val="000000" w:themeColor="text1"/>
+          <w:sz w:val="18"/>
+        </w:rPr>
+        <w:t>Stakeholder Management, Business Requirements Analysis, Cross-Functional Collaboration, Analytical Thinking, Communication Skills, Presentation Skills, Meeting Facilitation, Process Improvement, Data-Driven Decision Making</w:t>
       </w:r>
     </w:p>
     <w:p>
@@ -1646,15 +1723,23 @@
           <w:color w:val="000000" w:themeColor="text1"/>
           <w:sz w:val="18"/>
         </w:rPr>
-        <w:t>Kanban for Agile Teams — LinkedIn Learning</w:t>
-      </w:r>
-      <w:r>
-        <w:rPr>
-          <w:rFonts w:asciiTheme="minorHAnsi" w:eastAsia="Arial" w:hAnsiTheme="minorHAnsi" w:cstheme="minorHAnsi"/>
-          <w:color w:val="000000" w:themeColor="text1"/>
-          <w:sz w:val="18"/>
-        </w:rPr>
-        <w:t xml:space="preserve"> (July 2025)</w:t>
+        <w:t>Prompt E</w:t>
+      </w:r>
+      <w:r>
+        <w:rPr>
+          <w:rFonts w:asciiTheme="minorHAnsi" w:eastAsia="Arial" w:hAnsiTheme="minorHAnsi" w:cstheme="minorHAnsi"/>
+          <w:color w:val="000000" w:themeColor="text1"/>
+          <w:sz w:val="18"/>
+        </w:rPr>
+        <w:t>ngineering with the OpenAI API -</w:t>
+      </w:r>
+      <w:r>
+        <w:rPr>
+          <w:rFonts w:asciiTheme="minorHAnsi" w:eastAsia="Arial" w:hAnsiTheme="minorHAnsi" w:cstheme="minorHAnsi"/>
+          <w:color w:val="000000" w:themeColor="text1"/>
+          <w:sz w:val="18"/>
+        </w:rPr>
+        <w:t xml:space="preserve"> DataCamp (June 2026)</w:t>
       </w:r>
     </w:p>
     <w:p>
@@ -1678,15 +1763,15 @@
           <w:color w:val="000000" w:themeColor="text1"/>
           <w:sz w:val="18"/>
         </w:rPr>
-        <w:t>Root Cause Analysis: Getting to the Root of Business Problems — LinkedIn Learning</w:t>
-      </w:r>
-      <w:r>
-        <w:rPr>
-          <w:rFonts w:asciiTheme="minorHAnsi" w:eastAsia="Arial" w:hAnsiTheme="minorHAnsi" w:cstheme="minorHAnsi"/>
-          <w:color w:val="000000" w:themeColor="text1"/>
-          <w:sz w:val="18"/>
-        </w:rPr>
-        <w:t xml:space="preserve"> (Aug 2023)</w:t>
+        <w:t xml:space="preserve">Working with the OpenAI API - </w:t>
+      </w:r>
+      <w:r>
+        <w:rPr>
+          <w:rFonts w:asciiTheme="minorHAnsi" w:eastAsia="Arial" w:hAnsiTheme="minorHAnsi" w:cstheme="minorHAnsi"/>
+          <w:color w:val="000000" w:themeColor="text1"/>
+          <w:sz w:val="18"/>
+        </w:rPr>
+        <w:t>DataCamp (June 2026)</w:t>
       </w:r>
     </w:p>
     <w:p>
@@ -1710,41 +1795,66 @@
           <w:color w:val="000000" w:themeColor="text1"/>
           <w:sz w:val="18"/>
         </w:rPr>
-        <w:t xml:space="preserve">Data Analytics Professional Development </w:t>
-      </w:r>
-      <w:r>
-        <w:rPr>
-          <w:rFonts w:asciiTheme="minorHAnsi" w:eastAsia="Arial" w:hAnsiTheme="minorHAnsi" w:cstheme="minorHAnsi"/>
-          <w:color w:val="000000" w:themeColor="text1"/>
-          <w:sz w:val="18"/>
-        </w:rPr>
-        <w:t>(July 2022)</w:t>
+        <w:t xml:space="preserve">Kanban for Agile Teams </w:t>
+      </w:r>
+      <w:r>
+        <w:rPr>
+          <w:rFonts w:asciiTheme="minorHAnsi" w:eastAsia="Arial" w:hAnsiTheme="minorHAnsi" w:cstheme="minorHAnsi"/>
+          <w:color w:val="000000" w:themeColor="text1"/>
+          <w:sz w:val="18"/>
+        </w:rPr>
+        <w:t>-</w:t>
+      </w:r>
+      <w:r>
+        <w:rPr>
+          <w:rFonts w:asciiTheme="minorHAnsi" w:eastAsia="Arial" w:hAnsiTheme="minorHAnsi" w:cstheme="minorHAnsi"/>
+          <w:color w:val="000000" w:themeColor="text1"/>
+          <w:sz w:val="18"/>
+        </w:rPr>
+        <w:t xml:space="preserve"> Agile Academy (July 2025)</w:t>
       </w:r>
     </w:p>
     <w:p>
       <w:pPr>
         <w:pStyle w:val="ListParagraph"/>
-        <w:spacing w:before="40" w:after="40" w:line="360" w:lineRule="auto"/>
-        <w:ind w:left="440"/>
+        <w:numPr>
+          <w:ilvl w:val="0"/>
+          <w:numId w:val="2"/>
+        </w:numPr>
+        <w:spacing w:after="40" w:line="360" w:lineRule="auto"/>
+        <w:ind w:left="437" w:hanging="278"/>
         <w:rPr>
           <w:rFonts w:asciiTheme="minorHAnsi" w:hAnsiTheme="minorHAnsi" w:cstheme="minorHAnsi"/>
-        </w:rPr>
-      </w:pPr>
-    </w:p>
-    <w:p>
-      <w:pPr>
-        <w:pBdr>
-          <w:top w:val="single" w:sz="4" w:space="0" w:color="CCCCCC"/>
-        </w:pBdr>
-        <w:spacing w:before="120"/>
-        <w:jc w:val="center"/>
-        <w:rPr>
-          <w:rFonts w:asciiTheme="minorHAnsi" w:hAnsiTheme="minorHAnsi" w:cstheme="minorHAnsi"/>
-        </w:rPr>
-      </w:pPr>
+          <w:color w:val="000000" w:themeColor="text1"/>
+          <w:sz w:val="18"/>
+        </w:rPr>
+      </w:pPr>
+      <w:r>
+        <w:rPr>
+          <w:rFonts w:asciiTheme="minorHAnsi" w:eastAsia="Arial" w:hAnsiTheme="minorHAnsi" w:cstheme="minorHAnsi"/>
+          <w:color w:val="000000" w:themeColor="text1"/>
+          <w:sz w:val="18"/>
+        </w:rPr>
+        <w:t xml:space="preserve">Data Analytics Professional Development </w:t>
+      </w:r>
+      <w:r>
+        <w:rPr>
+          <w:rFonts w:asciiTheme="minorHAnsi" w:eastAsia="Arial" w:hAnsiTheme="minorHAnsi" w:cstheme="minorHAnsi"/>
+          <w:color w:val="000000" w:themeColor="text1"/>
+          <w:sz w:val="18"/>
+        </w:rPr>
+        <w:t xml:space="preserve">– Self-directed Learning </w:t>
+      </w:r>
+      <w:r>
+        <w:rPr>
+          <w:rFonts w:asciiTheme="minorHAnsi" w:eastAsia="Arial" w:hAnsiTheme="minorHAnsi" w:cstheme="minorHAnsi"/>
+          <w:color w:val="000000" w:themeColor="text1"/>
+          <w:sz w:val="18"/>
+        </w:rPr>
+        <w:t>(July 2024)</w:t>
+      </w:r>
     </w:p>
     <w:sectPr>
-      <w:footerReference w:type="default" r:id="rId9"/>
       <w:pgSz w:w="11906" w:h="16838"/>
       <w:pgMar w:top="900" w:right="1100" w:bottom="900" w:left="1100" w:header="708" w:footer="708" w:gutter="0"/>
       <w:cols w:space="720"/>
@@ -1771,62 +1881,6 @@
     </w:p>
   </w:endnote>
 </w:endnotes>
-</file>
-
-<file path=word/footer1.xml><?xml version="1.0" encoding="utf-8"?>
-<w:ftr xmlns:wpc="http://schemas.microsoft.com/office/word/2010/wordprocessingCanvas" xmlns:cx="http://schemas.microsoft.com/office/drawing/2014/chartex" xmlns:cx1="http://schemas.microsoft.com/office/drawing/2015/9/8/chartex" xmlns:mc="http://schemas.openxmlformats.org/markup-compatibility/2006" xmlns:o="urn:schemas-microsoft-com:office:office" xmlns:r="http://schemas.openxmlformats.org/officeDocument/2006/relationships" xmlns:m="http://schemas.openxmlformats.org/officeDocument/2006/math" xmlns:v="urn:schemas-microsoft-com:vml" xmlns:wp14="http://schemas.microsoft.com/office/word/2010/wordprocessingDrawing" xmlns:wp="http://schemas.openxmlformats.org/drawingml/2006/wordprocessingDrawing" xmlns:w10="urn:schemas-microsoft-com:office:word" xmlns:w="http://schemas.openxmlformats.org/wordprocessingml/2006/main" xmlns:w14="http://schemas.microsoft.com/office/word/2010/wordml" xmlns:w15="http://schemas.microsoft.com/office/word/2012/wordml" xmlns:w16se="http://schemas.microsoft.com/office/word/2015/wordml/symex" xmlns:wpg="http://schemas.microsoft.com/office/word/2010/wordprocessingGroup" xmlns:wpi="http://schemas.microsoft.com/office/word/2010/wordprocessingInk" xmlns:wne="http://schemas.microsoft.com/office/word/2006/wordml" xmlns:wps="http://schemas.microsoft.com/office/word/2010/wordprocessingShape" mc:Ignorable="w14 w15 w16se wp14">
-  <w:p>
-    <w:pPr>
-      <w:pBdr>
-        <w:top w:val="single" w:sz="4" w:space="6" w:color="CCCCCC"/>
-      </w:pBdr>
-      <w:spacing w:before="120"/>
-      <w:jc w:val="center"/>
-      <w:rPr>
-        <w:sz w:val="18"/>
-        <w:szCs w:val="18"/>
-      </w:rPr>
-    </w:pPr>
-    <w:r>
-      <w:rPr>
-        <w:rFonts w:ascii="Arial" w:eastAsia="Arial" w:hAnsi="Arial" w:cs="Arial"/>
-        <w:i/>
-        <w:iCs/>
-        <w:color w:val="888888"/>
-        <w:sz w:val="18"/>
-        <w:szCs w:val="18"/>
-      </w:rPr>
-      <w:t xml:space="preserve">References available upon request • </w:t>
-    </w:r>
-    <w:r>
-      <w:rPr>
-        <w:rFonts w:ascii="Arial" w:eastAsia="Arial" w:hAnsi="Arial" w:cs="Arial"/>
-        <w:i/>
-        <w:iCs/>
-        <w:color w:val="888888"/>
-        <w:sz w:val="18"/>
-        <w:szCs w:val="18"/>
-      </w:rPr>
-      <w:t xml:space="preserve">Available from: </w:t>
-    </w:r>
-    <w:r>
-      <w:rPr>
-        <w:rFonts w:ascii="Arial" w:eastAsia="Arial" w:hAnsi="Arial" w:cs="Arial"/>
-        <w:i/>
-        <w:iCs/>
-        <w:color w:val="888888"/>
-        <w:sz w:val="18"/>
-        <w:szCs w:val="18"/>
-      </w:rPr>
-      <w:t>15.09.2026</w:t>
-    </w:r>
-  </w:p>
-  <w:p>
-    <w:pPr>
-      <w:pStyle w:val="Footer"/>
-    </w:pPr>
-  </w:p>
-</w:ftr>
 </file>
 
 <file path=word/footnotes.xml><?xml version="1.0" encoding="utf-8"?>
@@ -2081,8 +2135,8 @@
   <w:abstractNum w:abstractNumId="2" w15:restartNumberingAfterBreak="0">
     <w:nsid w:val="6CEC5A26"/>
     <w:multiLevelType w:val="hybridMultilevel"/>
-    <w:tmpl w:val="36C0B304"/>
-    <w:lvl w:ilvl="0" w:tplc="3CC0F868">
+    <w:tmpl w:val="11FAEA52"/>
+    <w:lvl w:ilvl="0" w:tplc="D6A61500">
       <w:start w:val="1"/>
       <w:numFmt w:val="bullet"/>
       <w:lvlText w:val="•"/>
@@ -2091,7 +2145,7 @@
         <w:ind w:left="440" w:hanging="280"/>
       </w:pPr>
       <w:rPr>
-        <w:lang w:val="de-DE"/>
+        <w:lang w:val="en-GB"/>
       </w:rPr>
     </w:lvl>
     <w:lvl w:ilvl="1" w:tplc="4F18D792">
@@ -2629,7 +2683,7 @@
   <w:style w:type="paragraph" w:default="1" w:styleId="Normal">
     <w:name w:val="Normal"/>
     <w:qFormat/>
-    <w:rsid w:val="00521942"/>
+    <w:rsid w:val="00B821F3"/>
   </w:style>
   <w:style w:type="paragraph" w:styleId="Heading1">
     <w:name w:val="heading 1"/>
@@ -3120,7 +3174,7 @@
 </file>
 
 <file path=customXml/itemProps1.xml><?xml version="1.0" encoding="utf-8"?>
-<ds:datastoreItem xmlns:ds="http://schemas.openxmlformats.org/officeDocument/2006/customXml" ds:itemID="{AAF2416F-81D3-4591-8EC2-436417193298}">
+<ds:datastoreItem xmlns:ds="http://schemas.openxmlformats.org/officeDocument/2006/customXml" ds:itemID="{D7B5037E-DEF7-47FB-B0BA-24EBA78375FE}">
   <ds:schemaRefs>
     <ds:schemaRef ds:uri="http://schemas.openxmlformats.org/officeDocument/2006/bibliography"/>
   </ds:schemaRefs>

</xml_diff>